<commit_message>
docs: remove foro clause, add contract term/early-termination clause, fix budget revision rounds, fix clause cross-reference
</commit_message>
<xml_diff>
--- a/templates/ēloSites_Contrato_Padrao.docx
+++ b/templates/ēloSites_Contrato_Padrao.docx
@@ -478,7 +478,7 @@
           <w:sz w:val="22"/>
           <w:szCs w:val="22"/>
         </w:rPr>
-        <w:t xml:space="preserve">Manutenção contínua do site, quando não contratada separadamente (Cláusula 5).</w:t>
+        <w:t xml:space="preserve">Manutenção contínua do site, quando não contratada separadamente (Cláusula 6).</w:t>
       </w:r>
     </w:p>
     <w:p>
@@ -675,7 +675,58 @@
         <w:spacing w:after="150" w:before="300"/>
       </w:pPr>
       <w:r>
-        <w:t xml:space="preserve">5. Manutenção (opcional)</w:t>
+        <w:t xml:space="preserve">5. Vigência do contrato e rescisão antecipada</w:t>
+      </w:r>
+    </w:p>
+    <w:p>
+      <w:pPr>
+        <w:spacing w:after="160"/>
+        <w:jc w:val="both"/>
+      </w:pPr>
+      <w:r>
+        <w:rPr>
+          <w:rFonts w:ascii="Calibri" w:cs="Calibri" w:eastAsia="Calibri" w:hAnsi="Calibri"/>
+          <w:sz w:val="22"/>
+          <w:szCs w:val="22"/>
+        </w:rPr>
+        <w:t xml:space="preserve">Este contrato tem vigência de 24 (vinte e quatro) meses, contados a partir da data de assinatura, podendo ser renovado por igual período mediante acordo entre as partes, manifestado por escrito com antecedência mínima de 30 (trinta) dias do término da vigência.</w:t>
+      </w:r>
+    </w:p>
+    <w:p>
+      <w:pPr>
+        <w:spacing w:after="160"/>
+        <w:jc w:val="both"/>
+      </w:pPr>
+      <w:r>
+        <w:rPr>
+          <w:rFonts w:ascii="Calibri" w:cs="Calibri" w:eastAsia="Calibri" w:hAnsi="Calibri"/>
+          <w:sz w:val="22"/>
+          <w:szCs w:val="22"/>
+        </w:rPr>
+        <w:t xml:space="preserve">Caso o(a) CONTRATANTE opte por encerrar o contrato antes do término da vigência: (i) se o encerramento ocorrer dentro dos primeiros 12 (doze) meses de vigência, será devida ao(à) CONTRATADO(A) multa equivalente a 20% (vinte por cento) do valor total do projeto (Cláusula 3); (ii) se o encerramento ocorrer após os primeiros 12 (doze) meses de vigência, não haverá multa, mediante aviso prévio de 30 (trinta) dias.</w:t>
+      </w:r>
+    </w:p>
+    <w:p>
+      <w:pPr>
+        <w:spacing w:after="160"/>
+        <w:jc w:val="both"/>
+      </w:pPr>
+      <w:r>
+        <w:rPr>
+          <w:rFonts w:ascii="Calibri" w:cs="Calibri" w:eastAsia="Calibri" w:hAnsi="Calibri"/>
+          <w:sz w:val="22"/>
+          <w:szCs w:val="22"/>
+        </w:rPr>
+        <w:t xml:space="preserve">A multa prevista nesta cláusula é independente de eventual encerramento do plano de manutenção mensal (Cláusula 6), que segue suas próprias condições de cancelamento quando contratado separadamente.</w:t>
+      </w:r>
+    </w:p>
+    <w:p>
+      <w:pPr>
+        <w:pStyle w:val="Heading1"/>
+        <w:spacing w:after="150" w:before="300"/>
+      </w:pPr>
+      <w:r>
+        <w:t xml:space="preserve">6. Manutenção (opcional)</w:t>
       </w:r>
     </w:p>
     <w:p>
@@ -764,7 +815,7 @@
         <w:spacing w:after="150" w:before="300"/>
       </w:pPr>
       <w:r>
-        <w:t xml:space="preserve">6. Propriedade, direitos e infraestrutura</w:t>
+        <w:t xml:space="preserve">7. Propriedade, direitos e infraestrutura</w:t>
       </w:r>
     </w:p>
     <w:p>
@@ -829,7 +880,7 @@
         <w:spacing w:after="150" w:before="300"/>
       </w:pPr>
       <w:r>
-        <w:t xml:space="preserve">7. Responsabilidades do(a) CONTRATANTE</w:t>
+        <w:t xml:space="preserve">8. Responsabilidades do(a) CONTRATANTE</w:t>
       </w:r>
     </w:p>
     <w:p>
@@ -910,7 +961,7 @@
         <w:spacing w:after="150" w:before="300"/>
       </w:pPr>
       <w:r>
-        <w:t xml:space="preserve">8. Proteção de dados (LGPD)</w:t>
+        <w:t xml:space="preserve">9. Proteção de dados (LGPD)</w:t>
       </w:r>
     </w:p>
     <w:p>
@@ -933,7 +984,7 @@
         <w:spacing w:after="150" w:before="300"/>
       </w:pPr>
       <w:r>
-        <w:t xml:space="preserve">9. Rescisão</w:t>
+        <w:t xml:space="preserve">10. Rescisão</w:t>
       </w:r>
     </w:p>
     <w:p>
@@ -970,7 +1021,7 @@
         <w:spacing w:after="150" w:before="300"/>
       </w:pPr>
       <w:r>
-        <w:t xml:space="preserve">10. Disposições gerais</w:t>
+        <w:t xml:space="preserve">11. Disposições gerais</w:t>
       </w:r>
     </w:p>
     <w:p>
@@ -985,20 +1036,6 @@
           <w:szCs w:val="22"/>
         </w:rPr>
         <w:t xml:space="preserve">Este contrato representa o entendimento integral entre as partes sobre o objeto aqui tratado, substituindo entendimentos verbais anteriores. Qualquer alteração de escopo, prazo ou valor deverá ser formalizada por escrito (aditivo, e-mail ou mensagem), passando a integrar este contrato.</w:t>
-      </w:r>
-    </w:p>
-    <w:p>
-      <w:pPr>
-        <w:spacing w:after="160"/>
-        <w:jc w:val="both"/>
-      </w:pPr>
-      <w:r>
-        <w:rPr>
-          <w:rFonts w:ascii="Calibri" w:cs="Calibri" w:eastAsia="Calibri" w:hAnsi="Calibri"/>
-          <w:sz w:val="22"/>
-          <w:szCs w:val="22"/>
-        </w:rPr>
-        <w:t xml:space="preserve">Fica eleito o foro da comarca de [___] para dirimir eventuais controvérsias decorrentes deste contrato, com renúncia a qualquer outro, por mais privilegiado que seja.</w:t>
       </w:r>
     </w:p>
     <w:p>
@@ -1100,7 +1137,7 @@
           <w:sz w:val="20"/>
           <w:szCs w:val="20"/>
         </w:rPr>
-        <w:t xml:space="preserve">Este documento é um modelo técnico de referência, elaborado com base nas práticas comuns de contratos de prestação de serviços de desenvolvimento web e nas informações e preferências fornecidas pela ēloSites. Ele NÃO constitui aconselhamento jurídico. Antes de utilizar este contrato com clientes reais, recomenda-se fortemente a revisão por um(a) advogado(a), que poderá adequá-lo à legislação aplicável ao seu caso específico (incluindo eventual estrutura MEI/ME/Simples Nacional), corrigir eventuais lacunas e validar a cláusula de foro, prazos de rescisão e demais pontos sensíveis.</w:t>
+        <w:t xml:space="preserve">Este documento é um modelo técnico de referência, elaborado com base nas práticas comuns de contratos de prestação de serviços de desenvolvimento web e nas informações e preferências fornecidas pela ēloSites. Ele NÃO constitui aconselhamento jurídico. Antes de utilizar este contrato com clientes reais, recomenda-se fortemente a revisão por um(a) advogado(a), que poderá adequá-lo à legislação aplicável ao seu caso específico (incluindo eventual estrutura MEI/ME/Simples Nacional), corrigir eventuais lacunas e validar a cláusula de vigência e multa por rescisão antecipada, prazos de rescisão e demais pontos sensíveis.</w:t>
       </w:r>
     </w:p>
     <w:sectPr>

</xml_diff>